<commit_message>
Update copy deck: replace Notre approche with Questions fréquentes
Section 5 now contains the 8 FAQ Q&A items matching the site.
Nav updated from Approche to Questions, footer from Notre approche
to Questions fréquentes.

Co-Authored-By: Claude Opus 4.6 <noreply@anthropic.com>
</commit_message>
<xml_diff>
--- a/aurea-copydeck.docx
+++ b/aurea-copydeck.docx
@@ -126,7 +126,7 @@
         <w:pStyle w:val="ListBullet"/>
       </w:pPr>
       <w:r>
-        <w:t>Approche</w:t>
+        <w:t>Questions</w:t>
       </w:r>
     </w:p>
     <w:p>
@@ -731,7 +731,289 @@
         <w:pStyle w:val="Heading1"/>
       </w:pPr>
       <w:r>
-        <w:t>5. Notre approche</w:t>
+        <w:t xml:space="preserve">5. Questions fréquentes</w:t>
+      </w:r>
+    </w:p>
+    <w:p>
+      <w:pPr>
+        <w:pStyle w:val="Normal"/>
+      </w:pPr>
+      <w:r>
+        <w:rPr>
+          <w:b/>
+        </w:rPr>
+        <w:t xml:space="preserve">Tag de section</w:t>
+      </w:r>
+    </w:p>
+    <w:p>
+      <w:pPr>
+        <w:pStyle w:val="Normal"/>
+      </w:pPr>
+      <w:r>
+        <w:t xml:space="preserve">Questions fréquentes</w:t>
+      </w:r>
+    </w:p>
+    <w:p>
+      <w:pPr>
+        <w:pStyle w:val="Normal"/>
+      </w:pPr>
+      <w:r>
+        <w:rPr>
+          <w:b/>
+        </w:rPr>
+        <w:t xml:space="preserve">Titre</w:t>
+      </w:r>
+    </w:p>
+    <w:p>
+      <w:pPr>
+        <w:pStyle w:val="Normal"/>
+      </w:pPr>
+      <w:r>
+        <w:t xml:space="preserve">Ce que nos clients nous demandent souvent</w:t>
+      </w:r>
+    </w:p>
+    <w:p>
+      <w:pPr>
+        <w:pStyle w:val="Normal"/>
+      </w:pPr>
+      <w:r>
+        <w:rPr>
+          <w:b/>
+        </w:rPr>
+        <w:t xml:space="preserve">Intro</w:t>
+      </w:r>
+    </w:p>
+    <w:p>
+      <w:pPr>
+        <w:pStyle w:val="Normal"/>
+      </w:pPr>
+      <w:r>
+        <w:t xml:space="preserve">Chaque situation est unique, mais certaines questions reviennent régulièrement. Voici les réponses aux plus courantes.</w:t>
+      </w:r>
+    </w:p>
+    <w:p>
+      <w:pPr>
+        <w:pStyle w:val="Heading2"/>
+      </w:pPr>
+      <w:r>
+        <w:t xml:space="preserve">Q1 — Comment se déroule une enquête en harcèlement?</w:t>
+      </w:r>
+    </w:p>
+    <w:p>
+      <w:pPr>
+        <w:pStyle w:val="Normal"/>
+      </w:pPr>
+      <w:r>
+        <w:t xml:space="preserve">L’enquête débute par une prise de contact confidentielle pour comprendre la situation. Nous définissons ensuite le mandat, recueillons les témoignages de façon impartiale, analysons les faits à la lumière des critères juridiques applicables, et produisons un rapport détaillé avec des constats, conclusions et recommandations concrètes.</w:t>
+      </w:r>
+    </w:p>
+    <w:p>
+      <w:pPr>
+        <w:pStyle w:val="Heading2"/>
+      </w:pPr>
+      <w:r>
+        <w:t xml:space="preserve">Q2 — Est-ce que vos services sont vraiment indépendants?</w:t>
+      </w:r>
+    </w:p>
+    <w:p>
+      <w:pPr>
+        <w:pStyle w:val="Normal"/>
+      </w:pPr>
+      <w:r>
+        <w:t xml:space="preserve">Absolument. L’indépendance est au cœur de notre pratique. Nous n’avons aucun lien d’emploi avec les organisations que nous accompagnons, ce qui garantit une objectivité totale. Nos rapports et recommandations sont fondés uniquement sur les faits et les meilleures pratiques professionnelles.</w:t>
+      </w:r>
+    </w:p>
+    <w:p>
+      <w:pPr>
+        <w:pStyle w:val="Heading2"/>
+      </w:pPr>
+      <w:r>
+        <w:t xml:space="preserve">Q3 — Quelle est la différence entre médiation et enquête?</w:t>
+      </w:r>
+    </w:p>
+    <w:p>
+      <w:pPr>
+        <w:pStyle w:val="Normal"/>
+      </w:pPr>
+      <w:r>
+        <w:t xml:space="preserve">L’enquête vise à établir les faits et à déterminer si une situation constitue du harcèlement au sens de la loi. La médiation, elle, est un processus volontaire qui permet aux parties de coconstruire une solution durable, dans un espace confidentiel et sans jugement. Les deux démarches répondent à des besoins différents et peuvent parfois être complémentaires.</w:t>
+      </w:r>
+    </w:p>
+    <w:p>
+      <w:pPr>
+        <w:pStyle w:val="Heading2"/>
+      </w:pPr>
+      <w:r>
+        <w:t xml:space="preserve">Q4 — Combien de temps dure une intervention typique?</w:t>
+      </w:r>
+    </w:p>
+    <w:p>
+      <w:pPr>
+        <w:pStyle w:val="Normal"/>
+      </w:pPr>
+      <w:r>
+        <w:t xml:space="preserve">La durée varie selon la complexité du dossier. Une médiation peut se compléter en quelques séances sur deux à quatre semaines. Une enquête requiert généralement de quatre à huit semaines, selon le nombre de témoins et la portée du mandat. Nous établissons un échéancier réaliste dès le cadrage du mandat.</w:t>
+      </w:r>
+    </w:p>
+    <w:p>
+      <w:pPr>
+        <w:pStyle w:val="Heading2"/>
+      </w:pPr>
+      <w:r>
+        <w:t xml:space="preserve">Q5 — Pouvez-vous intervenir partout au Québec?</w:t>
+      </w:r>
+    </w:p>
+    <w:p>
+      <w:pPr>
+        <w:pStyle w:val="Normal"/>
+      </w:pPr>
+      <w:r>
+        <w:t xml:space="preserve">Oui. Bien que basés à Montréal, nous accompagnons des organisations dans l’ensemble du Québec. Plusieurs étapes du processus peuvent se faire à distance — entrevues par visioconférence, échanges sécurisés — tout en maintenant la rigueur et la confidentialité qui caractérisent notre pratique.</w:t>
+      </w:r>
+    </w:p>
+    <w:p>
+      <w:pPr>
+        <w:pStyle w:val="Heading2"/>
+      </w:pPr>
+      <w:r>
+        <w:t xml:space="preserve">Q6 — En quoi la prévention est-elle différente d’une simple politique?</w:t>
+      </w:r>
+    </w:p>
+    <w:p>
+      <w:pPr>
+        <w:pStyle w:val="Normal"/>
+      </w:pPr>
+      <w:r>
+        <w:t xml:space="preserve">Une politique est un document. La prévention est une culture. Nous aidons les organisations à aller au-delà des obligations légales en développant la capacité des leaders à lire les signaux faibles, en instaurant des pratiques de gestion prévisibles et en créant un climat où les tensions se résolvent avant de s’enraciner.</w:t>
+      </w:r>
+    </w:p>
+    <w:p>
+      <w:pPr>
+        <w:pStyle w:val="Heading2"/>
+      </w:pPr>
+      <w:r>
+        <w:t xml:space="preserve">Q7 — Qu’est-ce que la littératie émotionnelle en leadership?</w:t>
+      </w:r>
+    </w:p>
+    <w:p>
+      <w:pPr>
+        <w:pStyle w:val="Normal"/>
+      </w:pPr>
+      <w:r>
+        <w:t xml:space="preserve">C’est la capacité d’un leader à reconnaître, comprendre et répondre adéquatement aux dynamiques émotionnelles dans son équipe. Nos formations outillent les gestionnaires à repérer les tensions tôt, à désamorcer les conflits avant l’escalade et à créer un environnement où la sécurité psychologique est réelle — pas seulement déclarée.</w:t>
+      </w:r>
+    </w:p>
+    <w:p>
+      <w:pPr>
+        <w:pStyle w:val="Heading2"/>
+      </w:pPr>
+      <w:r>
+        <w:t xml:space="preserve">Q8 — Comment assurer la confidentialité tout au long du processus?</w:t>
+      </w:r>
+    </w:p>
+    <w:p>
+      <w:pPr>
+        <w:pStyle w:val="Normal"/>
+      </w:pPr>
+      <w:r>
+        <w:t xml:space="preserve">La confidentialité est encadrée dès le début du mandat par des règles claires, communiquées à toutes les parties. Les documents sont transmis de façon sécurisée, les entrevues se déroulent en privé, et seules les personnes autorisées ont accès au rapport final. Nous suivons les normes de l’Ordre des CRHA en matière de protection des renseignements.</w:t>
+      </w:r>
+    </w:p>
+    <w:p>
+      <w:pPr>
+        <w:spacing w:before="320" w:after="320"/>
+      </w:pPr>
+      <w:r>
+        <w:rPr>
+          <w:color w:val="CCCCCC"/>
+          <w:sz w:val="16"/>
+        </w:rPr>
+        <w:t>____________________________________________________________</w:t>
+      </w:r>
+    </w:p>
+    <w:p>
+      <w:pPr>
+        <w:pStyle w:val="Heading1"/>
+      </w:pPr>
+      <w:r>
+        <w:t>6. Bandeau d’appel à l’action (CTA)</w:t>
+      </w:r>
+    </w:p>
+    <w:p>
+      <w:pPr>
+        <w:spacing w:after="40"/>
+      </w:pPr>
+      <w:r>
+        <w:rPr>
+          <w:b/>
+          <w:caps/>
+          <w:color w:val="C8A44E"/>
+          <w:sz w:val="18"/>
+        </w:rPr>
+        <w:t>Titre</w:t>
+      </w:r>
+    </w:p>
+    <w:p>
+      <w:r>
+        <w:t>Prévention, prévention, prévention</w:t>
+      </w:r>
+    </w:p>
+    <w:p>
+      <w:pPr>
+        <w:spacing w:after="40"/>
+      </w:pPr>
+      <w:r>
+        <w:rPr>
+          <w:b/>
+          <w:caps/>
+          <w:color w:val="C8A44E"/>
+          <w:sz w:val="18"/>
+        </w:rPr>
+        <w:t>Texte</w:t>
+      </w:r>
+    </w:p>
+    <w:p>
+      <w:r>
+        <w:t>Les tensions au travail ne disparaissent pas d’elles-mêmes. Parlons-en avant que la situation ne s’escalade — en toute confidentialité.</w:t>
+      </w:r>
+    </w:p>
+    <w:p>
+      <w:pPr>
+        <w:spacing w:after="40"/>
+      </w:pPr>
+      <w:r>
+        <w:rPr>
+          <w:b/>
+          <w:caps/>
+          <w:color w:val="C8A44E"/>
+          <w:sz w:val="18"/>
+        </w:rPr>
+        <w:t>Bouton</w:t>
+      </w:r>
+    </w:p>
+    <w:p>
+      <w:r>
+        <w:t>Planifier une consultation</w:t>
+      </w:r>
+    </w:p>
+    <w:p>
+      <w:pPr>
+        <w:spacing w:before="320" w:after="320"/>
+      </w:pPr>
+      <w:r>
+        <w:rPr>
+          <w:color w:val="CCCCCC"/>
+          <w:sz w:val="16"/>
+        </w:rPr>
+        <w:t>____________________________________________________________</w:t>
+      </w:r>
+    </w:p>
+    <w:p>
+      <w:pPr>
+        <w:pStyle w:val="Heading1"/>
+      </w:pPr>
+      <w:r>
+        <w:t>7. Contact</w:t>
       </w:r>
     </w:p>
     <w:p>
@@ -750,7 +1032,7 @@
     </w:p>
     <w:p>
       <w:r>
-        <w:t>Notre approche</w:t>
+        <w:t>Contact</w:t>
       </w:r>
     </w:p>
     <w:p>
@@ -769,7 +1051,7 @@
     </w:p>
     <w:p>
       <w:r>
-        <w:t>Un processus structuré, des résultats durables</w:t>
+        <w:t>Parlons de votre situation</w:t>
       </w:r>
     </w:p>
     <w:p>
@@ -788,7 +1070,7 @@
     </w:p>
     <w:p>
       <w:r>
-        <w:t>Chaque intervention suit un cadre méthodologique éprouvé, adapté à la réalité unique de votre organisation.</w:t>
+        <w:t>Chaque échange est confidentiel. N’hésitez pas à nous joindre pour discuter de vos besoins.</w:t>
       </w:r>
     </w:p>
     <w:p>
@@ -796,12 +1078,39 @@
         <w:pStyle w:val="Heading2"/>
       </w:pPr>
       <w:r>
-        <w:t>Étape 01 — Écoute et analyse</w:t>
-      </w:r>
-    </w:p>
-    <w:p>
-      <w:r>
-        <w:t>Prise de contact confidentielle. Nous prenons le temps de comprendre votre situation dans toute sa complexité.</w:t>
+        <w:t>Coordonnées</w:t>
+      </w:r>
+    </w:p>
+    <w:p>
+      <w:pPr>
+        <w:pStyle w:val="ListBullet"/>
+      </w:pPr>
+      <w:r>
+        <w:t>Téléphone : 514 458-4661</w:t>
+      </w:r>
+    </w:p>
+    <w:p>
+      <w:pPr>
+        <w:pStyle w:val="ListBullet"/>
+      </w:pPr>
+      <w:r>
+        <w:t>Courriel : hugues.thibault@aurearhconseil.ca</w:t>
+      </w:r>
+    </w:p>
+    <w:p>
+      <w:pPr>
+        <w:pStyle w:val="ListBullet"/>
+      </w:pPr>
+      <w:r>
+        <w:t>Région desservie : Grand Montréal et partout au Québec</w:t>
+      </w:r>
+    </w:p>
+    <w:p>
+      <w:pPr>
+        <w:pStyle w:val="ListBullet"/>
+      </w:pPr>
+      <w:r>
+        <w:t>LinkedIn : Auréa RH Conseil</w:t>
       </w:r>
     </w:p>
     <w:p>
@@ -809,58 +1118,119 @@
         <w:pStyle w:val="Heading2"/>
       </w:pPr>
       <w:r>
-        <w:t>Étape 02 — Cadrage et mandat</w:t>
-      </w:r>
-    </w:p>
-    <w:p>
-      <w:r>
-        <w:t>Définition claire des objectifs, du périmètre d’intervention et des règles de confidentialité applicables.</w:t>
-      </w:r>
-    </w:p>
-    <w:p>
-      <w:pPr>
-        <w:pStyle w:val="Heading2"/>
-      </w:pPr>
-      <w:r>
-        <w:t>Étape 03 — Intervention</w:t>
-      </w:r>
-    </w:p>
-    <w:p>
-      <w:r>
-        <w:t>Mise en œuvre rigoureuse du mandat, dans le respect des personnes et des meilleures pratiques professionnelles.</w:t>
-      </w:r>
-    </w:p>
-    <w:p>
-      <w:pPr>
-        <w:pStyle w:val="Heading2"/>
-      </w:pPr>
-      <w:r>
-        <w:t>Étape 04 — Recommandations</w:t>
-      </w:r>
-    </w:p>
-    <w:p>
-      <w:r>
-        <w:t>Rapport détaillé avec constats, conclusions et recommandations concrètes pour l’avenir de votre organisation.</w:t>
-      </w:r>
-    </w:p>
-    <w:p>
-      <w:pPr>
-        <w:spacing w:before="320" w:after="320"/>
-      </w:pPr>
-      <w:r>
-        <w:rPr>
-          <w:color w:val="CCCCCC"/>
-          <w:sz w:val="16"/>
-        </w:rPr>
-        <w:t>____________________________________________________________</w:t>
-      </w:r>
-    </w:p>
-    <w:p>
-      <w:pPr>
-        <w:pStyle w:val="Heading1"/>
-      </w:pPr>
-      <w:r>
-        <w:t>6. Bandeau d’appel à l’action (CTA)</w:t>
+        <w:t>Formulaire de contact — Labels</w:t>
+      </w:r>
+    </w:p>
+    <w:p>
+      <w:pPr>
+        <w:pStyle w:val="ListBullet"/>
+      </w:pPr>
+      <w:r>
+        <w:t>Nom complet (placeholder : Votre nom)</w:t>
+      </w:r>
+    </w:p>
+    <w:p>
+      <w:pPr>
+        <w:pStyle w:val="ListBullet"/>
+      </w:pPr>
+      <w:r>
+        <w:t>Organisation (placeholder : Nom de votre organisation)</w:t>
+      </w:r>
+    </w:p>
+    <w:p>
+      <w:pPr>
+        <w:pStyle w:val="ListBullet"/>
+      </w:pPr>
+      <w:r>
+        <w:t>Courriel (placeholder : votre@courriel.com)</w:t>
+      </w:r>
+    </w:p>
+    <w:p>
+      <w:pPr>
+        <w:pStyle w:val="ListBullet"/>
+      </w:pPr>
+      <w:r>
+        <w:t>Téléphone (placeholder : 514 000-0000)</w:t>
+      </w:r>
+    </w:p>
+    <w:p>
+      <w:pPr>
+        <w:pStyle w:val="ListBullet"/>
+      </w:pPr>
+      <w:r>
+        <w:t>Service recherché (menu déroulant)</w:t>
+      </w:r>
+    </w:p>
+    <w:p>
+      <w:pPr>
+        <w:pStyle w:val="Heading3"/>
+      </w:pPr>
+      <w:r>
+        <w:t>Options du menu déroulant « Service recherché »</w:t>
+      </w:r>
+    </w:p>
+    <w:p>
+      <w:pPr>
+        <w:pStyle w:val="ListBullet"/>
+      </w:pPr>
+      <w:r>
+        <w:t>Sélectionner un service</w:t>
+      </w:r>
+    </w:p>
+    <w:p>
+      <w:pPr>
+        <w:pStyle w:val="ListBullet"/>
+      </w:pPr>
+      <w:r>
+        <w:t>Enquête en harcèlement et incivilité</w:t>
+      </w:r>
+    </w:p>
+    <w:p>
+      <w:pPr>
+        <w:pStyle w:val="ListBullet"/>
+      </w:pPr>
+      <w:r>
+        <w:t>Médiation et résolution des différends</w:t>
+      </w:r>
+    </w:p>
+    <w:p>
+      <w:pPr>
+        <w:pStyle w:val="ListBullet"/>
+      </w:pPr>
+      <w:r>
+        <w:t>Relations de travail et situations sensibles</w:t>
+      </w:r>
+    </w:p>
+    <w:p>
+      <w:pPr>
+        <w:pStyle w:val="ListBullet"/>
+      </w:pPr>
+      <w:r>
+        <w:t>Prévention du harcèlement et des RPS</w:t>
+      </w:r>
+    </w:p>
+    <w:p>
+      <w:pPr>
+        <w:pStyle w:val="ListBullet"/>
+      </w:pPr>
+      <w:r>
+        <w:t>Formation en leadership</w:t>
+      </w:r>
+    </w:p>
+    <w:p>
+      <w:pPr>
+        <w:pStyle w:val="ListBullet"/>
+      </w:pPr>
+      <w:r>
+        <w:t>Conseil stratégique</w:t>
+      </w:r>
+    </w:p>
+    <w:p>
+      <w:pPr>
+        <w:pStyle w:val="ListBullet"/>
+      </w:pPr>
+      <w:r>
+        <w:t>Autre</w:t>
       </w:r>
     </w:p>
     <w:p>
@@ -874,31 +1244,12 @@
           <w:color w:val="C8A44E"/>
           <w:sz w:val="18"/>
         </w:rPr>
-        <w:t>Titre</w:t>
-      </w:r>
-    </w:p>
-    <w:p>
-      <w:r>
-        <w:t>Prévention, prévention, prévention</w:t>
-      </w:r>
-    </w:p>
-    <w:p>
-      <w:pPr>
-        <w:spacing w:after="40"/>
-      </w:pPr>
-      <w:r>
-        <w:rPr>
-          <w:b/>
-          <w:caps/>
-          <w:color w:val="C8A44E"/>
-          <w:sz w:val="18"/>
-        </w:rPr>
-        <w:t>Texte</w:t>
-      </w:r>
-    </w:p>
-    <w:p>
-      <w:r>
-        <w:t>Les tensions au travail ne disparaissent pas d’elles-mêmes. Parlons-en avant que la situation ne s’escalade — en toute confidentialité.</w:t>
+        <w:t>Champ message</w:t>
+      </w:r>
+    </w:p>
+    <w:p>
+      <w:r>
+        <w:t>Message (placeholder : Décrivez brièvement votre situation ou vos besoins…)</w:t>
       </w:r>
     </w:p>
     <w:p>
@@ -917,281 +1268,6 @@
     </w:p>
     <w:p>
       <w:r>
-        <w:t>Planifier une consultation</w:t>
-      </w:r>
-    </w:p>
-    <w:p>
-      <w:pPr>
-        <w:spacing w:before="320" w:after="320"/>
-      </w:pPr>
-      <w:r>
-        <w:rPr>
-          <w:color w:val="CCCCCC"/>
-          <w:sz w:val="16"/>
-        </w:rPr>
-        <w:t>____________________________________________________________</w:t>
-      </w:r>
-    </w:p>
-    <w:p>
-      <w:pPr>
-        <w:pStyle w:val="Heading1"/>
-      </w:pPr>
-      <w:r>
-        <w:t>7. Contact</w:t>
-      </w:r>
-    </w:p>
-    <w:p>
-      <w:pPr>
-        <w:spacing w:after="40"/>
-      </w:pPr>
-      <w:r>
-        <w:rPr>
-          <w:b/>
-          <w:caps/>
-          <w:color w:val="C8A44E"/>
-          <w:sz w:val="18"/>
-        </w:rPr>
-        <w:t>Tag de section</w:t>
-      </w:r>
-    </w:p>
-    <w:p>
-      <w:r>
-        <w:t>Contact</w:t>
-      </w:r>
-    </w:p>
-    <w:p>
-      <w:pPr>
-        <w:spacing w:after="40"/>
-      </w:pPr>
-      <w:r>
-        <w:rPr>
-          <w:b/>
-          <w:caps/>
-          <w:color w:val="C8A44E"/>
-          <w:sz w:val="18"/>
-        </w:rPr>
-        <w:t>Titre</w:t>
-      </w:r>
-    </w:p>
-    <w:p>
-      <w:r>
-        <w:t>Parlons de votre situation</w:t>
-      </w:r>
-    </w:p>
-    <w:p>
-      <w:pPr>
-        <w:spacing w:after="40"/>
-      </w:pPr>
-      <w:r>
-        <w:rPr>
-          <w:b/>
-          <w:caps/>
-          <w:color w:val="C8A44E"/>
-          <w:sz w:val="18"/>
-        </w:rPr>
-        <w:t>Intro</w:t>
-      </w:r>
-    </w:p>
-    <w:p>
-      <w:r>
-        <w:t>Chaque échange est confidentiel. N’hésitez pas à nous joindre pour discuter de vos besoins.</w:t>
-      </w:r>
-    </w:p>
-    <w:p>
-      <w:pPr>
-        <w:pStyle w:val="Heading2"/>
-      </w:pPr>
-      <w:r>
-        <w:t>Coordonnées</w:t>
-      </w:r>
-    </w:p>
-    <w:p>
-      <w:pPr>
-        <w:pStyle w:val="ListBullet"/>
-      </w:pPr>
-      <w:r>
-        <w:t>Téléphone : 514 458-4661</w:t>
-      </w:r>
-    </w:p>
-    <w:p>
-      <w:pPr>
-        <w:pStyle w:val="ListBullet"/>
-      </w:pPr>
-      <w:r>
-        <w:t>Courriel : hugues.thibault@aurearhconseil.ca</w:t>
-      </w:r>
-    </w:p>
-    <w:p>
-      <w:pPr>
-        <w:pStyle w:val="ListBullet"/>
-      </w:pPr>
-      <w:r>
-        <w:t>Région desservie : Grand Montréal et partout au Québec</w:t>
-      </w:r>
-    </w:p>
-    <w:p>
-      <w:pPr>
-        <w:pStyle w:val="ListBullet"/>
-      </w:pPr>
-      <w:r>
-        <w:t>LinkedIn : Auréa RH Conseil</w:t>
-      </w:r>
-    </w:p>
-    <w:p>
-      <w:pPr>
-        <w:pStyle w:val="Heading2"/>
-      </w:pPr>
-      <w:r>
-        <w:t>Formulaire de contact — Labels</w:t>
-      </w:r>
-    </w:p>
-    <w:p>
-      <w:pPr>
-        <w:pStyle w:val="ListBullet"/>
-      </w:pPr>
-      <w:r>
-        <w:t>Nom complet (placeholder : Votre nom)</w:t>
-      </w:r>
-    </w:p>
-    <w:p>
-      <w:pPr>
-        <w:pStyle w:val="ListBullet"/>
-      </w:pPr>
-      <w:r>
-        <w:t>Organisation (placeholder : Nom de votre organisation)</w:t>
-      </w:r>
-    </w:p>
-    <w:p>
-      <w:pPr>
-        <w:pStyle w:val="ListBullet"/>
-      </w:pPr>
-      <w:r>
-        <w:t>Courriel (placeholder : votre@courriel.com)</w:t>
-      </w:r>
-    </w:p>
-    <w:p>
-      <w:pPr>
-        <w:pStyle w:val="ListBullet"/>
-      </w:pPr>
-      <w:r>
-        <w:t>Téléphone (placeholder : 514 000-0000)</w:t>
-      </w:r>
-    </w:p>
-    <w:p>
-      <w:pPr>
-        <w:pStyle w:val="ListBullet"/>
-      </w:pPr>
-      <w:r>
-        <w:t>Service recherché (menu déroulant)</w:t>
-      </w:r>
-    </w:p>
-    <w:p>
-      <w:pPr>
-        <w:pStyle w:val="Heading3"/>
-      </w:pPr>
-      <w:r>
-        <w:t>Options du menu déroulant « Service recherché »</w:t>
-      </w:r>
-    </w:p>
-    <w:p>
-      <w:pPr>
-        <w:pStyle w:val="ListBullet"/>
-      </w:pPr>
-      <w:r>
-        <w:t>Sélectionner un service</w:t>
-      </w:r>
-    </w:p>
-    <w:p>
-      <w:pPr>
-        <w:pStyle w:val="ListBullet"/>
-      </w:pPr>
-      <w:r>
-        <w:t>Enquête en harcèlement et incivilité</w:t>
-      </w:r>
-    </w:p>
-    <w:p>
-      <w:pPr>
-        <w:pStyle w:val="ListBullet"/>
-      </w:pPr>
-      <w:r>
-        <w:t>Médiation et résolution des différends</w:t>
-      </w:r>
-    </w:p>
-    <w:p>
-      <w:pPr>
-        <w:pStyle w:val="ListBullet"/>
-      </w:pPr>
-      <w:r>
-        <w:t>Relations de travail et situations sensibles</w:t>
-      </w:r>
-    </w:p>
-    <w:p>
-      <w:pPr>
-        <w:pStyle w:val="ListBullet"/>
-      </w:pPr>
-      <w:r>
-        <w:t>Prévention du harcèlement et des RPS</w:t>
-      </w:r>
-    </w:p>
-    <w:p>
-      <w:pPr>
-        <w:pStyle w:val="ListBullet"/>
-      </w:pPr>
-      <w:r>
-        <w:t>Formation en leadership</w:t>
-      </w:r>
-    </w:p>
-    <w:p>
-      <w:pPr>
-        <w:pStyle w:val="ListBullet"/>
-      </w:pPr>
-      <w:r>
-        <w:t>Conseil stratégique</w:t>
-      </w:r>
-    </w:p>
-    <w:p>
-      <w:pPr>
-        <w:pStyle w:val="ListBullet"/>
-      </w:pPr>
-      <w:r>
-        <w:t>Autre</w:t>
-      </w:r>
-    </w:p>
-    <w:p>
-      <w:pPr>
-        <w:spacing w:after="40"/>
-      </w:pPr>
-      <w:r>
-        <w:rPr>
-          <w:b/>
-          <w:caps/>
-          <w:color w:val="C8A44E"/>
-          <w:sz w:val="18"/>
-        </w:rPr>
-        <w:t>Champ message</w:t>
-      </w:r>
-    </w:p>
-    <w:p>
-      <w:r>
-        <w:t>Message (placeholder : Décrivez brièvement votre situation ou vos besoins…)</w:t>
-      </w:r>
-    </w:p>
-    <w:p>
-      <w:pPr>
-        <w:spacing w:after="40"/>
-      </w:pPr>
-      <w:r>
-        <w:rPr>
-          <w:b/>
-          <w:caps/>
-          <w:color w:val="C8A44E"/>
-          <w:sz w:val="18"/>
-        </w:rPr>
-        <w:t>Bouton</w:t>
-      </w:r>
-    </w:p>
-    <w:p>
-      <w:r>
         <w:t>Envoyer le message</w:t>
       </w:r>
     </w:p>
@@ -1330,7 +1406,7 @@
         <w:pStyle w:val="ListBullet"/>
       </w:pPr>
       <w:r>
-        <w:t>Notre approche</w:t>
+        <w:t>Questions fréquentes</w:t>
       </w:r>
     </w:p>
     <w:p>

</xml_diff>

<commit_message>
Copy deck with revision markup: red for new, strikethrough for removed
Add revision guide at top. Old Notre approche content kept with
strikethrough, new Questions fréquentes FAQ in red. Nav and footer
changes also marked. Ready for client review.

Co-Authored-By: Claude Opus 4.6 <noreply@anthropic.com>
</commit_message>
<xml_diff>
--- a/aurea-copydeck.docx
+++ b/aurea-copydeck.docx
@@ -60,6 +60,84 @@
       </w:r>
     </w:p>
     <w:p>
+      <w:pPr>
+        <w:pStyle w:val="Normal"/>
+      </w:pPr>
+      <w:r>
+        <w:rPr/>
+        <w:t xml:space="preserve"/>
+      </w:r>
+    </w:p>
+    <w:p>
+      <w:pPr>
+        <w:pStyle w:val="Normal"/>
+      </w:pPr>
+      <w:r>
+        <w:rPr/>
+        <w:t xml:space="preserve">____________________________________________________________</w:t>
+      </w:r>
+    </w:p>
+    <w:p>
+      <w:pPr>
+        <w:pStyle w:val="Normal"/>
+      </w:pPr>
+      <w:r>
+        <w:rPr>
+          <w:b/>
+        </w:rPr>
+        <w:t xml:space="preserve">GUIDE DE RÉVISION</w:t>
+      </w:r>
+    </w:p>
+    <w:p>
+      <w:pPr>
+        <w:pStyle w:val="Normal"/>
+      </w:pPr>
+      <w:r>
+        <w:rPr>
+          <w:color w:val="CC0000"/>
+        </w:rPr>
+        <w:t xml:space="preserve">Texte en rouge = contenu nouveau ou modifié — à réviser et ajuster au besoin.</w:t>
+      </w:r>
+    </w:p>
+    <w:p>
+      <w:pPr>
+        <w:pStyle w:val="Normal"/>
+      </w:pPr>
+      <w:r>
+        <w:rPr>
+          <w:strike/>
+        </w:rPr>
+        <w:t xml:space="preserve">Texte barré = contenu supprimé du site — conservé ici pour référence.</w:t>
+      </w:r>
+    </w:p>
+    <w:p>
+      <w:pPr>
+        <w:pStyle w:val="Normal"/>
+      </w:pPr>
+      <w:r>
+        <w:rPr/>
+        <w:t xml:space="preserve">Texte en noir = contenu inchangé — aucune action requise.</w:t>
+      </w:r>
+    </w:p>
+    <w:p>
+      <w:pPr>
+        <w:pStyle w:val="Normal"/>
+      </w:pPr>
+      <w:r>
+        <w:rPr/>
+        <w:t xml:space="preserve">____________________________________________________________</w:t>
+      </w:r>
+    </w:p>
+    <w:p>
+      <w:pPr>
+        <w:pStyle w:val="Normal"/>
+      </w:pPr>
+      <w:r>
+        <w:rPr/>
+        <w:t xml:space="preserve"/>
+      </w:r>
+    </w:p>
+    <w:p>
       <w:r>
         <w:br w:type="page"/>
       </w:r>
@@ -126,7 +204,21 @@
         <w:pStyle w:val="ListBullet"/>
       </w:pPr>
       <w:r>
-        <w:t>Questions</w:t>
+        <w:rPr>
+          <w:strike/>
+        </w:rPr>
+        <w:t>Approche</w:t>
+      </w:r>
+    </w:p>
+    <w:p>
+      <w:pPr>
+        <w:pStyle w:val="ListBullet"/>
+      </w:pPr>
+      <w:r>
+        <w:rPr>
+          <w:color w:val="CC0000"/>
+        </w:rPr>
+        <w:t xml:space="preserve">Questions</w:t>
       </w:r>
     </w:p>
     <w:p>
@@ -731,16 +823,206 @@
         <w:pStyle w:val="Heading1"/>
       </w:pPr>
       <w:r>
-        <w:t xml:space="preserve">5. Questions fréquentes</w:t>
-      </w:r>
-    </w:p>
-    <w:p>
-      <w:pPr>
-        <w:pStyle w:val="Normal"/>
+        <w:rPr>
+          <w:strike/>
+        </w:rPr>
+        <w:t>5. Notre approche</w:t>
+      </w:r>
+    </w:p>
+    <w:p>
+      <w:pPr>
+        <w:spacing w:after="40"/>
       </w:pPr>
       <w:r>
         <w:rPr>
           <w:b/>
+          <w:caps/>
+          <w:color w:val="C8A44E"/>
+          <w:sz w:val="18"/>
+          <w:strike/>
+        </w:rPr>
+        <w:t>Tag de section</w:t>
+      </w:r>
+    </w:p>
+    <w:p>
+      <w:r>
+        <w:rPr>
+          <w:strike/>
+        </w:rPr>
+        <w:t>Notre approche</w:t>
+      </w:r>
+    </w:p>
+    <w:p>
+      <w:pPr>
+        <w:spacing w:after="40"/>
+      </w:pPr>
+      <w:r>
+        <w:rPr>
+          <w:b/>
+          <w:caps/>
+          <w:color w:val="C8A44E"/>
+          <w:sz w:val="18"/>
+          <w:strike/>
+        </w:rPr>
+        <w:t>Titre</w:t>
+      </w:r>
+    </w:p>
+    <w:p>
+      <w:r>
+        <w:rPr>
+          <w:strike/>
+        </w:rPr>
+        <w:t>Un processus structuré, des résultats durables</w:t>
+      </w:r>
+    </w:p>
+    <w:p>
+      <w:pPr>
+        <w:spacing w:after="40"/>
+      </w:pPr>
+      <w:r>
+        <w:rPr>
+          <w:b/>
+          <w:caps/>
+          <w:color w:val="C8A44E"/>
+          <w:sz w:val="18"/>
+          <w:strike/>
+        </w:rPr>
+        <w:t>Intro</w:t>
+      </w:r>
+    </w:p>
+    <w:p>
+      <w:r>
+        <w:rPr>
+          <w:strike/>
+        </w:rPr>
+        <w:t>Chaque intervention suit un cadre méthodologique éprouvé, adapté à la réalité unique de votre organisation.</w:t>
+      </w:r>
+    </w:p>
+    <w:p>
+      <w:pPr>
+        <w:pStyle w:val="Heading2"/>
+      </w:pPr>
+      <w:r>
+        <w:rPr>
+          <w:strike/>
+        </w:rPr>
+        <w:t>Étape 01 — Écoute et analyse</w:t>
+      </w:r>
+    </w:p>
+    <w:p>
+      <w:r>
+        <w:rPr>
+          <w:strike/>
+        </w:rPr>
+        <w:t>Prise de contact confidentielle. Nous prenons le temps de comprendre votre situation dans toute sa complexité.</w:t>
+      </w:r>
+    </w:p>
+    <w:p>
+      <w:pPr>
+        <w:pStyle w:val="Heading2"/>
+      </w:pPr>
+      <w:r>
+        <w:rPr>
+          <w:strike/>
+        </w:rPr>
+        <w:t>Étape 02 — Cadrage et mandat</w:t>
+      </w:r>
+    </w:p>
+    <w:p>
+      <w:r>
+        <w:rPr>
+          <w:strike/>
+        </w:rPr>
+        <w:t>Définition claire des objectifs, du périmètre d’intervention et des règles de confidentialité applicables.</w:t>
+      </w:r>
+    </w:p>
+    <w:p>
+      <w:pPr>
+        <w:pStyle w:val="Heading2"/>
+      </w:pPr>
+      <w:r>
+        <w:rPr>
+          <w:strike/>
+        </w:rPr>
+        <w:t>Étape 03 — Intervention</w:t>
+      </w:r>
+    </w:p>
+    <w:p>
+      <w:r>
+        <w:rPr>
+          <w:strike/>
+        </w:rPr>
+        <w:t>Mise en œuvre rigoureuse du mandat, dans le respect des personnes et des meilleures pratiques professionnelles.</w:t>
+      </w:r>
+    </w:p>
+    <w:p>
+      <w:pPr>
+        <w:pStyle w:val="Heading2"/>
+      </w:pPr>
+      <w:r>
+        <w:rPr>
+          <w:strike/>
+        </w:rPr>
+        <w:t>Étape 04 — Recommandations</w:t>
+      </w:r>
+    </w:p>
+    <w:p>
+      <w:r>
+        <w:rPr>
+          <w:strike/>
+        </w:rPr>
+        <w:t>Rapport détaillé avec constats, conclusions et recommandations concrètes pour l’avenir de votre organisation.</w:t>
+      </w:r>
+    </w:p>
+    <w:p>
+      <w:pPr>
+        <w:pStyle w:val="Normal"/>
+      </w:pPr>
+      <w:r>
+        <w:rPr/>
+        <w:t xml:space="preserve"/>
+      </w:r>
+    </w:p>
+    <w:p>
+      <w:pPr>
+        <w:pStyle w:val="Normal"/>
+      </w:pPr>
+      <w:r>
+        <w:rPr>
+          <w:b/>
+          <w:color w:val="CC0000"/>
+        </w:rPr>
+        <w:t xml:space="preserve">▼ NOUVEAU CONTENU (remplace la section ci-dessus) ▼</w:t>
+      </w:r>
+    </w:p>
+    <w:p>
+      <w:pPr>
+        <w:pStyle w:val="Normal"/>
+      </w:pPr>
+      <w:r>
+        <w:rPr/>
+        <w:t xml:space="preserve"/>
+      </w:r>
+    </w:p>
+    <w:p>
+      <w:pPr>
+        <w:pStyle w:val="Heading1"/>
+      </w:pPr>
+      <w:r>
+        <w:rPr>
+          <w:color w:val="CC0000"/>
+        </w:rPr>
+        <w:t xml:space="preserve">5. Questions fréquentes</w:t>
+      </w:r>
+    </w:p>
+    <w:p>
+      <w:pPr>
+        <w:pStyle w:val="Normal"/>
+      </w:pPr>
+      <w:r>
+        <w:rPr>
+          <w:b/>
+          <w:color w:val="CC0000"/>
         </w:rPr>
         <w:t xml:space="preserve">Tag de section</w:t>
       </w:r>
@@ -750,6 +1032,9 @@
         <w:pStyle w:val="Normal"/>
       </w:pPr>
       <w:r>
+        <w:rPr>
+          <w:color w:val="CC0000"/>
+        </w:rPr>
         <w:t xml:space="preserve">Questions fréquentes</w:t>
       </w:r>
     </w:p>
@@ -760,6 +1045,7 @@
       <w:r>
         <w:rPr>
           <w:b/>
+          <w:color w:val="CC0000"/>
         </w:rPr>
         <w:t xml:space="preserve">Titre</w:t>
       </w:r>
@@ -769,6 +1055,9 @@
         <w:pStyle w:val="Normal"/>
       </w:pPr>
       <w:r>
+        <w:rPr>
+          <w:color w:val="CC0000"/>
+        </w:rPr>
         <w:t xml:space="preserve">Ce que nos clients nous demandent souvent</w:t>
       </w:r>
     </w:p>
@@ -779,6 +1068,7 @@
       <w:r>
         <w:rPr>
           <w:b/>
+          <w:color w:val="CC0000"/>
         </w:rPr>
         <w:t xml:space="preserve">Intro</w:t>
       </w:r>
@@ -788,6 +1078,9 @@
         <w:pStyle w:val="Normal"/>
       </w:pPr>
       <w:r>
+        <w:rPr>
+          <w:color w:val="CC0000"/>
+        </w:rPr>
         <w:t xml:space="preserve">Chaque situation est unique, mais certaines questions reviennent régulièrement. Voici les réponses aux plus courantes.</w:t>
       </w:r>
     </w:p>
@@ -796,6 +1089,9 @@
         <w:pStyle w:val="Heading2"/>
       </w:pPr>
       <w:r>
+        <w:rPr>
+          <w:color w:val="CC0000"/>
+        </w:rPr>
         <w:t xml:space="preserve">Q1 — Comment se déroule une enquête en harcèlement?</w:t>
       </w:r>
     </w:p>
@@ -804,6 +1100,9 @@
         <w:pStyle w:val="Normal"/>
       </w:pPr>
       <w:r>
+        <w:rPr>
+          <w:color w:val="CC0000"/>
+        </w:rPr>
         <w:t xml:space="preserve">L’enquête débute par une prise de contact confidentielle pour comprendre la situation. Nous définissons ensuite le mandat, recueillons les témoignages de façon impartiale, analysons les faits à la lumière des critères juridiques applicables, et produisons un rapport détaillé avec des constats, conclusions et recommandations concrètes.</w:t>
       </w:r>
     </w:p>
@@ -812,6 +1111,9 @@
         <w:pStyle w:val="Heading2"/>
       </w:pPr>
       <w:r>
+        <w:rPr>
+          <w:color w:val="CC0000"/>
+        </w:rPr>
         <w:t xml:space="preserve">Q2 — Est-ce que vos services sont vraiment indépendants?</w:t>
       </w:r>
     </w:p>
@@ -820,6 +1122,9 @@
         <w:pStyle w:val="Normal"/>
       </w:pPr>
       <w:r>
+        <w:rPr>
+          <w:color w:val="CC0000"/>
+        </w:rPr>
         <w:t xml:space="preserve">Absolument. L’indépendance est au cœur de notre pratique. Nous n’avons aucun lien d’emploi avec les organisations que nous accompagnons, ce qui garantit une objectivité totale. Nos rapports et recommandations sont fondés uniquement sur les faits et les meilleures pratiques professionnelles.</w:t>
       </w:r>
     </w:p>
@@ -828,6 +1133,9 @@
         <w:pStyle w:val="Heading2"/>
       </w:pPr>
       <w:r>
+        <w:rPr>
+          <w:color w:val="CC0000"/>
+        </w:rPr>
         <w:t xml:space="preserve">Q3 — Quelle est la différence entre médiation et enquête?</w:t>
       </w:r>
     </w:p>
@@ -836,6 +1144,9 @@
         <w:pStyle w:val="Normal"/>
       </w:pPr>
       <w:r>
+        <w:rPr>
+          <w:color w:val="CC0000"/>
+        </w:rPr>
         <w:t xml:space="preserve">L’enquête vise à établir les faits et à déterminer si une situation constitue du harcèlement au sens de la loi. La médiation, elle, est un processus volontaire qui permet aux parties de coconstruire une solution durable, dans un espace confidentiel et sans jugement. Les deux démarches répondent à des besoins différents et peuvent parfois être complémentaires.</w:t>
       </w:r>
     </w:p>
@@ -844,6 +1155,9 @@
         <w:pStyle w:val="Heading2"/>
       </w:pPr>
       <w:r>
+        <w:rPr>
+          <w:color w:val="CC0000"/>
+        </w:rPr>
         <w:t xml:space="preserve">Q4 — Combien de temps dure une intervention typique?</w:t>
       </w:r>
     </w:p>
@@ -852,6 +1166,9 @@
         <w:pStyle w:val="Normal"/>
       </w:pPr>
       <w:r>
+        <w:rPr>
+          <w:color w:val="CC0000"/>
+        </w:rPr>
         <w:t xml:space="preserve">La durée varie selon la complexité du dossier. Une médiation peut se compléter en quelques séances sur deux à quatre semaines. Une enquête requiert généralement de quatre à huit semaines, selon le nombre de témoins et la portée du mandat. Nous établissons un échéancier réaliste dès le cadrage du mandat.</w:t>
       </w:r>
     </w:p>
@@ -860,6 +1177,9 @@
         <w:pStyle w:val="Heading2"/>
       </w:pPr>
       <w:r>
+        <w:rPr>
+          <w:color w:val="CC0000"/>
+        </w:rPr>
         <w:t xml:space="preserve">Q5 — Pouvez-vous intervenir partout au Québec?</w:t>
       </w:r>
     </w:p>
@@ -868,6 +1188,9 @@
         <w:pStyle w:val="Normal"/>
       </w:pPr>
       <w:r>
+        <w:rPr>
+          <w:color w:val="CC0000"/>
+        </w:rPr>
         <w:t xml:space="preserve">Oui. Bien que basés à Montréal, nous accompagnons des organisations dans l’ensemble du Québec. Plusieurs étapes du processus peuvent se faire à distance — entrevues par visioconférence, échanges sécurisés — tout en maintenant la rigueur et la confidentialité qui caractérisent notre pratique.</w:t>
       </w:r>
     </w:p>
@@ -876,6 +1199,9 @@
         <w:pStyle w:val="Heading2"/>
       </w:pPr>
       <w:r>
+        <w:rPr>
+          <w:color w:val="CC0000"/>
+        </w:rPr>
         <w:t xml:space="preserve">Q6 — En quoi la prévention est-elle différente d’une simple politique?</w:t>
       </w:r>
     </w:p>
@@ -884,6 +1210,9 @@
         <w:pStyle w:val="Normal"/>
       </w:pPr>
       <w:r>
+        <w:rPr>
+          <w:color w:val="CC0000"/>
+        </w:rPr>
         <w:t xml:space="preserve">Une politique est un document. La prévention est une culture. Nous aidons les organisations à aller au-delà des obligations légales en développant la capacité des leaders à lire les signaux faibles, en instaurant des pratiques de gestion prévisibles et en créant un climat où les tensions se résolvent avant de s’enraciner.</w:t>
       </w:r>
     </w:p>
@@ -892,6 +1221,9 @@
         <w:pStyle w:val="Heading2"/>
       </w:pPr>
       <w:r>
+        <w:rPr>
+          <w:color w:val="CC0000"/>
+        </w:rPr>
         <w:t xml:space="preserve">Q7 — Qu’est-ce que la littératie émotionnelle en leadership?</w:t>
       </w:r>
     </w:p>
@@ -900,6 +1232,9 @@
         <w:pStyle w:val="Normal"/>
       </w:pPr>
       <w:r>
+        <w:rPr>
+          <w:color w:val="CC0000"/>
+        </w:rPr>
         <w:t xml:space="preserve">C’est la capacité d’un leader à reconnaître, comprendre et répondre adéquatement aux dynamiques émotionnelles dans son équipe. Nos formations outillent les gestionnaires à repérer les tensions tôt, à désamorcer les conflits avant l’escalade et à créer un environnement où la sécurité psychologique est réelle — pas seulement déclarée.</w:t>
       </w:r>
     </w:p>
@@ -908,6 +1243,9 @@
         <w:pStyle w:val="Heading2"/>
       </w:pPr>
       <w:r>
+        <w:rPr>
+          <w:color w:val="CC0000"/>
+        </w:rPr>
         <w:t xml:space="preserve">Q8 — Comment assurer la confidentialité tout au long du processus?</w:t>
       </w:r>
     </w:p>
@@ -916,6 +1254,9 @@
         <w:pStyle w:val="Normal"/>
       </w:pPr>
       <w:r>
+        <w:rPr>
+          <w:color w:val="CC0000"/>
+        </w:rPr>
         <w:t xml:space="preserve">La confidentialité est encadrée dès le début du mandat par des règles claires, communiquées à toutes les parties. Les documents sont transmis de façon sécurisée, les entrevues se déroulent en privé, et seules les personnes autorisées ont accès au rapport final. Nous suivons les normes de l’Ordre des CRHA en matière de protection des renseignements.</w:t>
       </w:r>
     </w:p>
@@ -1406,7 +1747,21 @@
         <w:pStyle w:val="ListBullet"/>
       </w:pPr>
       <w:r>
-        <w:t>Questions fréquentes</w:t>
+        <w:rPr>
+          <w:strike/>
+        </w:rPr>
+        <w:t>Notre approche</w:t>
+      </w:r>
+    </w:p>
+    <w:p>
+      <w:pPr>
+        <w:pStyle w:val="ListBullet"/>
+      </w:pPr>
+      <w:r>
+        <w:rPr>
+          <w:color w:val="CC0000"/>
+        </w:rPr>
+        <w:t xml:space="preserve">Questions fréquentes</w:t>
       </w:r>
     </w:p>
     <w:p>

</xml_diff>

<commit_message>
Copy deck: FAQ content in black for client editing
Co-Authored-By: Claude Opus 4.6 <noreply@anthropic.com>
</commit_message>
<xml_diff>
--- a/aurea-copydeck.docx
+++ b/aurea-copydeck.docx
@@ -1009,9 +1009,7 @@
         <w:pStyle w:val="Heading1"/>
       </w:pPr>
       <w:r>
-        <w:rPr>
-          <w:color w:val="CC0000"/>
-        </w:rPr>
+        <w:rPr/>
         <w:t xml:space="preserve">5. Questions fréquentes</w:t>
       </w:r>
     </w:p>
@@ -1022,7 +1020,6 @@
       <w:r>
         <w:rPr>
           <w:b/>
-          <w:color w:val="CC0000"/>
         </w:rPr>
         <w:t xml:space="preserve">Tag de section</w:t>
       </w:r>
@@ -1032,9 +1029,7 @@
         <w:pStyle w:val="Normal"/>
       </w:pPr>
       <w:r>
-        <w:rPr>
-          <w:color w:val="CC0000"/>
-        </w:rPr>
+        <w:rPr/>
         <w:t xml:space="preserve">Questions fréquentes</w:t>
       </w:r>
     </w:p>
@@ -1045,7 +1040,6 @@
       <w:r>
         <w:rPr>
           <w:b/>
-          <w:color w:val="CC0000"/>
         </w:rPr>
         <w:t xml:space="preserve">Titre</w:t>
       </w:r>
@@ -1055,9 +1049,7 @@
         <w:pStyle w:val="Normal"/>
       </w:pPr>
       <w:r>
-        <w:rPr>
-          <w:color w:val="CC0000"/>
-        </w:rPr>
+        <w:rPr/>
         <w:t xml:space="preserve">Ce que nos clients nous demandent souvent</w:t>
       </w:r>
     </w:p>
@@ -1068,7 +1060,6 @@
       <w:r>
         <w:rPr>
           <w:b/>
-          <w:color w:val="CC0000"/>
         </w:rPr>
         <w:t xml:space="preserve">Intro</w:t>
       </w:r>
@@ -1078,9 +1069,7 @@
         <w:pStyle w:val="Normal"/>
       </w:pPr>
       <w:r>
-        <w:rPr>
-          <w:color w:val="CC0000"/>
-        </w:rPr>
+        <w:rPr/>
         <w:t xml:space="preserve">Chaque situation est unique, mais certaines questions reviennent régulièrement. Voici les réponses aux plus courantes.</w:t>
       </w:r>
     </w:p>
@@ -1089,9 +1078,7 @@
         <w:pStyle w:val="Heading2"/>
       </w:pPr>
       <w:r>
-        <w:rPr>
-          <w:color w:val="CC0000"/>
-        </w:rPr>
+        <w:rPr/>
         <w:t xml:space="preserve">Q1 — Comment se déroule une enquête en harcèlement?</w:t>
       </w:r>
     </w:p>
@@ -1100,9 +1087,7 @@
         <w:pStyle w:val="Normal"/>
       </w:pPr>
       <w:r>
-        <w:rPr>
-          <w:color w:val="CC0000"/>
-        </w:rPr>
+        <w:rPr/>
         <w:t xml:space="preserve">L’enquête débute par une prise de contact confidentielle pour comprendre la situation. Nous définissons ensuite le mandat, recueillons les témoignages de façon impartiale, analysons les faits à la lumière des critères juridiques applicables, et produisons un rapport détaillé avec des constats, conclusions et recommandations concrètes.</w:t>
       </w:r>
     </w:p>
@@ -1111,9 +1096,7 @@
         <w:pStyle w:val="Heading2"/>
       </w:pPr>
       <w:r>
-        <w:rPr>
-          <w:color w:val="CC0000"/>
-        </w:rPr>
+        <w:rPr/>
         <w:t xml:space="preserve">Q2 — Est-ce que vos services sont vraiment indépendants?</w:t>
       </w:r>
     </w:p>
@@ -1122,9 +1105,7 @@
         <w:pStyle w:val="Normal"/>
       </w:pPr>
       <w:r>
-        <w:rPr>
-          <w:color w:val="CC0000"/>
-        </w:rPr>
+        <w:rPr/>
         <w:t xml:space="preserve">Absolument. L’indépendance est au cœur de notre pratique. Nous n’avons aucun lien d’emploi avec les organisations que nous accompagnons, ce qui garantit une objectivité totale. Nos rapports et recommandations sont fondés uniquement sur les faits et les meilleures pratiques professionnelles.</w:t>
       </w:r>
     </w:p>
@@ -1133,9 +1114,7 @@
         <w:pStyle w:val="Heading2"/>
       </w:pPr>
       <w:r>
-        <w:rPr>
-          <w:color w:val="CC0000"/>
-        </w:rPr>
+        <w:rPr/>
         <w:t xml:space="preserve">Q3 — Quelle est la différence entre médiation et enquête?</w:t>
       </w:r>
     </w:p>
@@ -1144,9 +1123,7 @@
         <w:pStyle w:val="Normal"/>
       </w:pPr>
       <w:r>
-        <w:rPr>
-          <w:color w:val="CC0000"/>
-        </w:rPr>
+        <w:rPr/>
         <w:t xml:space="preserve">L’enquête vise à établir les faits et à déterminer si une situation constitue du harcèlement au sens de la loi. La médiation, elle, est un processus volontaire qui permet aux parties de coconstruire une solution durable, dans un espace confidentiel et sans jugement. Les deux démarches répondent à des besoins différents et peuvent parfois être complémentaires.</w:t>
       </w:r>
     </w:p>
@@ -1155,9 +1132,7 @@
         <w:pStyle w:val="Heading2"/>
       </w:pPr>
       <w:r>
-        <w:rPr>
-          <w:color w:val="CC0000"/>
-        </w:rPr>
+        <w:rPr/>
         <w:t xml:space="preserve">Q4 — Combien de temps dure une intervention typique?</w:t>
       </w:r>
     </w:p>
@@ -1166,9 +1141,7 @@
         <w:pStyle w:val="Normal"/>
       </w:pPr>
       <w:r>
-        <w:rPr>
-          <w:color w:val="CC0000"/>
-        </w:rPr>
+        <w:rPr/>
         <w:t xml:space="preserve">La durée varie selon la complexité du dossier. Une médiation peut se compléter en quelques séances sur deux à quatre semaines. Une enquête requiert généralement de quatre à huit semaines, selon le nombre de témoins et la portée du mandat. Nous établissons un échéancier réaliste dès le cadrage du mandat.</w:t>
       </w:r>
     </w:p>
@@ -1177,9 +1150,7 @@
         <w:pStyle w:val="Heading2"/>
       </w:pPr>
       <w:r>
-        <w:rPr>
-          <w:color w:val="CC0000"/>
-        </w:rPr>
+        <w:rPr/>
         <w:t xml:space="preserve">Q5 — Pouvez-vous intervenir partout au Québec?</w:t>
       </w:r>
     </w:p>
@@ -1188,9 +1159,7 @@
         <w:pStyle w:val="Normal"/>
       </w:pPr>
       <w:r>
-        <w:rPr>
-          <w:color w:val="CC0000"/>
-        </w:rPr>
+        <w:rPr/>
         <w:t xml:space="preserve">Oui. Bien que basés à Montréal, nous accompagnons des organisations dans l’ensemble du Québec. Plusieurs étapes du processus peuvent se faire à distance — entrevues par visioconférence, échanges sécurisés — tout en maintenant la rigueur et la confidentialité qui caractérisent notre pratique.</w:t>
       </w:r>
     </w:p>
@@ -1199,9 +1168,7 @@
         <w:pStyle w:val="Heading2"/>
       </w:pPr>
       <w:r>
-        <w:rPr>
-          <w:color w:val="CC0000"/>
-        </w:rPr>
+        <w:rPr/>
         <w:t xml:space="preserve">Q6 — En quoi la prévention est-elle différente d’une simple politique?</w:t>
       </w:r>
     </w:p>
@@ -1210,9 +1177,7 @@
         <w:pStyle w:val="Normal"/>
       </w:pPr>
       <w:r>
-        <w:rPr>
-          <w:color w:val="CC0000"/>
-        </w:rPr>
+        <w:rPr/>
         <w:t xml:space="preserve">Une politique est un document. La prévention est une culture. Nous aidons les organisations à aller au-delà des obligations légales en développant la capacité des leaders à lire les signaux faibles, en instaurant des pratiques de gestion prévisibles et en créant un climat où les tensions se résolvent avant de s’enraciner.</w:t>
       </w:r>
     </w:p>
@@ -1221,9 +1186,7 @@
         <w:pStyle w:val="Heading2"/>
       </w:pPr>
       <w:r>
-        <w:rPr>
-          <w:color w:val="CC0000"/>
-        </w:rPr>
+        <w:rPr/>
         <w:t xml:space="preserve">Q7 — Qu’est-ce que la littératie émotionnelle en leadership?</w:t>
       </w:r>
     </w:p>
@@ -1232,9 +1195,7 @@
         <w:pStyle w:val="Normal"/>
       </w:pPr>
       <w:r>
-        <w:rPr>
-          <w:color w:val="CC0000"/>
-        </w:rPr>
+        <w:rPr/>
         <w:t xml:space="preserve">C’est la capacité d’un leader à reconnaître, comprendre et répondre adéquatement aux dynamiques émotionnelles dans son équipe. Nos formations outillent les gestionnaires à repérer les tensions tôt, à désamorcer les conflits avant l’escalade et à créer un environnement où la sécurité psychologique est réelle — pas seulement déclarée.</w:t>
       </w:r>
     </w:p>
@@ -1243,9 +1204,7 @@
         <w:pStyle w:val="Heading2"/>
       </w:pPr>
       <w:r>
-        <w:rPr>
-          <w:color w:val="CC0000"/>
-        </w:rPr>
+        <w:rPr/>
         <w:t xml:space="preserve">Q8 — Comment assurer la confidentialité tout au long du processus?</w:t>
       </w:r>
     </w:p>
@@ -1254,9 +1213,7 @@
         <w:pStyle w:val="Normal"/>
       </w:pPr>
       <w:r>
-        <w:rPr>
-          <w:color w:val="CC0000"/>
-        </w:rPr>
+        <w:rPr/>
         <w:t xml:space="preserve">La confidentialité est encadrée dès le début du mandat par des règles claires, communiquées à toutes les parties. Les documents sont transmis de façon sécurisée, les entrevues se déroulent en privé, et seules les personnes autorisées ont accès au rapport final. Nous suivons les normes de l’Ordre des CRHA en matière de protection des renseignements.</w:t>
       </w:r>
     </w:p>

</xml_diff>